<commit_message>
Unify canonical document tags across UI, Word, PDF and drawing frames
</commit_message>
<xml_diff>
--- a/ui/reference-templates/quantities.docx
+++ b/ui/reference-templates/quantities.docx
@@ -21,22 +21,22 @@
         <w:jc w:val="center"/>
       </w:pPr>
       <w:r>
-        <w:t>к АОСР № {{Номер_Акта}}</w:t>
+        <w:t>к АОСР № {{АОСР.Номер}}</w:t>
       </w:r>
     </w:p>
     <w:p>
       <w:r>
-        <w:t>Объект: {{Объект}}</w:t>
+        <w:t>Объект: {{Объект.Наименование}}</w:t>
       </w:r>
     </w:p>
     <w:p>
       <w:r>
-        <w:t>Проект: {{Проект_Ведомости}}</w:t>
+        <w:t>Проект: {{Ведомость.Проект}}</w:t>
       </w:r>
     </w:p>
     <w:p>
       <w:r>
-        <w:t>Период выполнения работ: {{Дата_Начала}} — {{Дата_Окончания}}</w:t>
+        <w:t>Период выполнения работ: {{АОСР.Начало}} — {{АОСР.Окончание}}</w:t>
       </w:r>
     </w:p>
     <w:tbl>
@@ -233,12 +233,12 @@
     <w:p/>
     <w:p>
       <w:r>
-        <w:t>Основание: {{Основание_Ведомости}}</w:t>
+        <w:t>Основание: {{Ведомость.Основание}}</w:t>
       </w:r>
     </w:p>
     <w:p>
       <w:r>
-        <w:t>{{Примечание_Ведомости}}</w:t>
+        <w:t>{{Ведомость.Примечание}}</w:t>
       </w:r>
     </w:p>
     <w:p>
@@ -247,7 +247,7 @@
         <w:spacing w:before="180"/>
       </w:pPr>
       <w:r>
-        <w:t>Составил: __________________ / {{ФИО_Подписант_5}}</w:t>
+        <w:t>Составил: __________________ / {{Подписанты.ИсполнительРабот.ФамилияИнициалы}}</w:t>
       </w:r>
     </w:p>
     <w:p>
@@ -256,7 +256,7 @@
         <w:spacing w:before="180"/>
       </w:pPr>
       <w:r>
-        <w:t>Проверил: __________________ / {{ФИО_Подписант_3}}</w:t>
+        <w:t>Проверил: __________________ / {{Подписанты.СтройконтрольПодрядчика.ФамилияИнициалы}}</w:t>
       </w:r>
     </w:p>
     <w:sectPr>

</xml_diff>